<commit_message>
Complete repository cleanup and enhancement - remove large forks, add new features and documentation
</commit_message>
<xml_diff>
--- a/Other Files/Prompt - Institutional-Grade Augmentation for Candlestick Patterns.docx
+++ b/Other Files/Prompt - Institutional-Grade Augmentation for Candlestick Patterns.docx
@@ -84,15 +84,7 @@
         <w:t>“</w:t>
       </w:r>
       <w:r>
-        <w:t>C:\Users\Vincent_Pereira\Projects\Algo_Trading_Projects\Trae\Algorithmic Trading System\</w:t>
-      </w:r>
-      <w:proofErr w:type="spellStart"/>
-      <w:r>
-        <w:t>nautilus_trader_engine</w:t>
-      </w:r>
-      <w:proofErr w:type="spellEnd"/>
-      <w:r>
-        <w:t>\indicators</w:t>
+        <w:t>C:\Users\Vincent_Pereira\Projects\Algo_Trading_Projects\Trae\Algorithmic Trading System\nautilus_trader_engine\indicators</w:t>
       </w:r>
       <w:r>
         <w:t>”</w:t>
@@ -114,216 +106,14 @@
         <w:rPr>
           <w:color w:val="000000" w:themeColor="text1"/>
         </w:rPr>
-        <w:t xml:space="preserve">Based on the </w:t>
+        <w:t>E</w:t>
       </w:r>
       <w:r>
         <w:rPr>
           <w:color w:val="000000" w:themeColor="text1"/>
         </w:rPr>
-        <w:t xml:space="preserve">following </w:t>
-      </w:r>
-      <w:r>
-        <w:rPr>
-          <w:color w:val="000000" w:themeColor="text1"/>
-        </w:rPr>
-        <w:t>resources, expand the pattern detection library and, crucially, refactor and enhance the entire pattern recognition system with institutional-grade features. The goal is to transform pattern signals from simple binary triggers into confidence-weighted, risk-aware decisions.</w:t>
-      </w:r>
-    </w:p>
-    <w:p>
-      <w:pPr>
-        <w:spacing w:line="240" w:lineRule="auto"/>
-        <w:rPr>
-          <w:color w:val="000000" w:themeColor="text1"/>
-        </w:rPr>
-      </w:pPr>
-    </w:p>
-    <w:p>
-      <w:pPr>
-        <w:spacing w:line="240" w:lineRule="auto"/>
-        <w:rPr>
-          <w:color w:val="000000" w:themeColor="text1"/>
-        </w:rPr>
-      </w:pPr>
-      <w:r>
-        <w:rPr>
-          <w:color w:val="000000" w:themeColor="text1"/>
-        </w:rPr>
-        <w:t xml:space="preserve">I would like you to go through these websites, understand it thoroughly, and incorporate these candlestick patterns as well as the Trading Rules, </w:t>
-      </w:r>
-      <w:proofErr w:type="spellStart"/>
-      <w:r>
-        <w:rPr>
-          <w:color w:val="000000" w:themeColor="text1"/>
-        </w:rPr>
-        <w:t>Backtests</w:t>
-      </w:r>
-      <w:proofErr w:type="spellEnd"/>
-      <w:r>
-        <w:rPr>
-          <w:color w:val="000000" w:themeColor="text1"/>
-        </w:rPr>
-        <w:t xml:space="preserve"> or any other information / ideas into the Algorithmic Trading System:</w:t>
-      </w:r>
-    </w:p>
-    <w:p>
-      <w:pPr>
-        <w:pStyle w:val="ListParagraph"/>
-        <w:numPr>
-          <w:ilvl w:val="0"/>
-          <w:numId w:val="3"/>
-        </w:numPr>
-        <w:spacing w:line="240" w:lineRule="auto"/>
-        <w:rPr>
-          <w:b/>
-          <w:bCs/>
-          <w:color w:val="000000" w:themeColor="text1"/>
-        </w:rPr>
-      </w:pPr>
-      <w:r>
-        <w:rPr>
-          <w:b/>
-          <w:bCs/>
-          <w:color w:val="000000" w:themeColor="text1"/>
-        </w:rPr>
-        <w:t xml:space="preserve">75 Different Types of Candlestick Patterns (Trading Rules + </w:t>
-      </w:r>
-      <w:proofErr w:type="spellStart"/>
-      <w:r>
-        <w:rPr>
-          <w:b/>
-          <w:bCs/>
-          <w:color w:val="000000" w:themeColor="text1"/>
-        </w:rPr>
-        <w:t>Backtests</w:t>
-      </w:r>
-      <w:proofErr w:type="spellEnd"/>
-      <w:r>
-        <w:rPr>
-          <w:b/>
-          <w:bCs/>
-          <w:color w:val="000000" w:themeColor="text1"/>
-        </w:rPr>
-        <w:t>)</w:t>
-      </w:r>
-    </w:p>
-    <w:p>
-      <w:pPr>
-        <w:spacing w:line="240" w:lineRule="auto"/>
-        <w:ind w:firstLine="360"/>
-      </w:pPr>
-      <w:hyperlink r:id="rId5" w:history="1">
-        <w:r>
-          <w:rPr>
-            <w:rStyle w:val="Hyperlink"/>
-          </w:rPr>
-          <w:t>https://www.quantifiedstrategies.com/types-of-candlesticks-patterns/</w:t>
-        </w:r>
-      </w:hyperlink>
-    </w:p>
-    <w:p>
-      <w:pPr>
-        <w:pStyle w:val="ListParagraph"/>
-        <w:numPr>
-          <w:ilvl w:val="0"/>
-          <w:numId w:val="3"/>
-        </w:numPr>
-        <w:spacing w:line="240" w:lineRule="auto"/>
-        <w:rPr>
-          <w:b/>
-          <w:bCs/>
-        </w:rPr>
-      </w:pPr>
-      <w:r>
-        <w:rPr>
-          <w:b/>
-          <w:bCs/>
-        </w:rPr>
-        <w:t>Candlestick Patterns: The Updated Complete Guide</w:t>
-      </w:r>
-    </w:p>
-    <w:p>
-      <w:pPr>
-        <w:spacing w:line="240" w:lineRule="auto"/>
-        <w:ind w:firstLine="360"/>
-      </w:pPr>
-      <w:hyperlink r:id="rId6" w:history="1">
-        <w:r>
-          <w:rPr>
-            <w:rStyle w:val="Hyperlink"/>
-          </w:rPr>
-          <w:t>https://www.morpher.com/blog/candlestick-patterns</w:t>
-        </w:r>
-      </w:hyperlink>
-    </w:p>
-    <w:p>
-      <w:pPr>
-        <w:pStyle w:val="ListParagraph"/>
-        <w:numPr>
-          <w:ilvl w:val="0"/>
-          <w:numId w:val="3"/>
-        </w:numPr>
-        <w:spacing w:line="240" w:lineRule="auto"/>
-        <w:rPr>
-          <w:b/>
-          <w:bCs/>
-        </w:rPr>
-      </w:pPr>
-      <w:r>
-        <w:rPr>
-          <w:b/>
-          <w:bCs/>
-        </w:rPr>
-        <w:t>45 Candlestick Patterns Every Trader Must Know</w:t>
-      </w:r>
-    </w:p>
-    <w:p>
-      <w:pPr>
-        <w:spacing w:line="240" w:lineRule="auto"/>
-        <w:ind w:firstLine="360"/>
-      </w:pPr>
-      <w:hyperlink r:id="rId7" w:history="1">
-        <w:r>
-          <w:rPr>
-            <w:rStyle w:val="Hyperlink"/>
-          </w:rPr>
-          <w:t>https://www.xs.com/en/blog/candlestick-patterns-types/</w:t>
-        </w:r>
-      </w:hyperlink>
-    </w:p>
-    <w:p>
-      <w:pPr>
-        <w:pStyle w:val="ListParagraph"/>
-        <w:numPr>
-          <w:ilvl w:val="0"/>
-          <w:numId w:val="3"/>
-        </w:numPr>
-        <w:spacing w:line="240" w:lineRule="auto"/>
-        <w:rPr>
-          <w:b/>
-          <w:bCs/>
-        </w:rPr>
-      </w:pPr>
-      <w:r>
-        <w:rPr>
-          <w:b/>
-          <w:bCs/>
-        </w:rPr>
-        <w:t>40 Powerful Candlestick Patterns: A Complete Trading Guide for Beginner Traders</w:t>
-      </w:r>
-    </w:p>
-    <w:p>
-      <w:pPr>
-        <w:spacing w:line="240" w:lineRule="auto"/>
-        <w:ind w:firstLine="360"/>
-      </w:pPr>
-      <w:hyperlink r:id="rId8" w:history="1">
-        <w:r>
-          <w:rPr>
-            <w:rStyle w:val="Hyperlink"/>
-          </w:rPr>
-          <w:t>https://www.strike.money/technical-analysis/types-of-candlesticks-patterns</w:t>
-        </w:r>
-      </w:hyperlink>
+        <w:t>xpand the pattern detection library and, crucially, refactor and enhance the entire pattern recognition system with institutional-grade features. The goal is to transform pattern signals from simple binary triggers into confidence-weighted, risk-aware decisions.</w:t>
+      </w:r>
     </w:p>
     <w:p>
       <w:pPr>
@@ -366,13 +156,8 @@
         </w:numPr>
         <w:spacing w:line="240" w:lineRule="auto"/>
       </w:pPr>
-      <w:proofErr w:type="spellStart"/>
-      <w:r>
-        <w:t>Analyze</w:t>
-      </w:r>
-      <w:proofErr w:type="spellEnd"/>
-      <w:r>
-        <w:t xml:space="preserve"> the four provided websites to extract the formal rules and definitions for all listed candlestick patterns.</w:t>
+      <w:r>
+        <w:t>Analyze the four provided websites to extract the formal rules and definitions for all listed candlestick patterns.</w:t>
       </w:r>
     </w:p>
     <w:p>
@@ -465,23 +250,7 @@
         <w:t>:</w:t>
       </w:r>
       <w:r>
-        <w:t> A score (e.g., 0.0 to 1.0) based on how volume during the pattern formation compares to the recent average (e.g., </w:t>
-      </w:r>
-      <w:proofErr w:type="spellStart"/>
-      <w:r>
-        <w:t>current_volume</w:t>
-      </w:r>
-      <w:proofErr w:type="spellEnd"/>
-      <w:r>
-        <w:t xml:space="preserve"> / </w:t>
-      </w:r>
-      <w:proofErr w:type="spellStart"/>
-      <w:r>
-        <w:t>n_period_volume_ma</w:t>
-      </w:r>
-      <w:proofErr w:type="spellEnd"/>
-      <w:r>
-        <w:t>). A score &gt;1.2 should reinforce the pattern; &lt;0.8 should weaken it.</w:t>
+        <w:t> A score (e.g., 0.0 to 1.0) based on how volume during the pattern formation compares to the recent average (e.g., current_volume / n_period_volume_ma). A score &gt;1.2 should reinforce the pattern; &lt;0.8 should weaken it.</w:t>
       </w:r>
     </w:p>
     <w:p>
@@ -614,15 +383,7 @@
         <w:t>Institutional Bias Assessment:</w:t>
       </w:r>
       <w:r>
-        <w:t xml:space="preserve"> If data is available, </w:t>
-      </w:r>
-      <w:proofErr w:type="spellStart"/>
-      <w:r>
-        <w:t>analyze</w:t>
-      </w:r>
-      <w:proofErr w:type="spellEnd"/>
-      <w:r>
-        <w:t xml:space="preserve"> Open Interest changes or other derivatives data for confluence.</w:t>
+        <w:t> If data is available, analyze Open Interest changes or other derivatives data for confluence.</w:t>
       </w:r>
     </w:p>
     <w:p>
@@ -673,51 +434,10 @@
           <w:b/>
           <w:bCs/>
         </w:rPr>
-        <w:lastRenderedPageBreak/>
         <w:t>Risk-Adjusted Signal Output:</w:t>
       </w:r>
       <w:r>
-        <w:t> The final output for a detected pattern must be a tuple or object containing: (</w:t>
-      </w:r>
-      <w:proofErr w:type="spellStart"/>
-      <w:r>
-        <w:t>pattern_name</w:t>
-      </w:r>
-      <w:proofErr w:type="spellEnd"/>
-      <w:r>
-        <w:t xml:space="preserve">, </w:t>
-      </w:r>
-      <w:proofErr w:type="spellStart"/>
-      <w:r>
-        <w:t>base_signal</w:t>
-      </w:r>
-      <w:proofErr w:type="spellEnd"/>
-      <w:r>
-        <w:t xml:space="preserve">, </w:t>
-      </w:r>
-      <w:proofErr w:type="spellStart"/>
-      <w:r>
-        <w:t>composite_confidence_score</w:t>
-      </w:r>
-      <w:proofErr w:type="spellEnd"/>
-      <w:r>
-        <w:t xml:space="preserve">, </w:t>
-      </w:r>
-      <w:proofErr w:type="spellStart"/>
-      <w:r>
-        <w:t>suggested_stop_loss</w:t>
-      </w:r>
-      <w:proofErr w:type="spellEnd"/>
-      <w:r>
-        <w:t xml:space="preserve">, </w:t>
-      </w:r>
-      <w:proofErr w:type="spellStart"/>
-      <w:r>
-        <w:t>suggested_profit_target</w:t>
-      </w:r>
-      <w:proofErr w:type="spellEnd"/>
-      <w:r>
-        <w:t>).</w:t>
+        <w:t> The final output for a detected pattern must be a tuple or object containing: (pattern_name, base_signal, composite_confidence_score, suggested_stop_loss, suggested_profit_target).</w:t>
       </w:r>
     </w:p>
     <w:p>
@@ -744,27 +464,16 @@
         </w:numPr>
         <w:spacing w:line="240" w:lineRule="auto"/>
       </w:pPr>
-      <w:proofErr w:type="gramStart"/>
       <w:r>
         <w:rPr>
           <w:b/>
           <w:bCs/>
         </w:rPr>
-        <w:t>Update</w:t>
-      </w:r>
-      <w:proofErr w:type="gramEnd"/>
-      <w:r>
-        <w:rPr>
-          <w:b/>
-          <w:bCs/>
-        </w:rPr>
-        <w:t> </w:t>
-      </w:r>
-      <w:proofErr w:type="spellStart"/>
+        <w:t>Update </w:t>
+      </w:r>
       <w:r>
         <w:t>detect_all_patterns</w:t>
       </w:r>
-      <w:proofErr w:type="spellEnd"/>
       <w:r>
         <w:rPr>
           <w:b/>
@@ -792,39 +501,7 @@
         <w:t>Enhance Pattern Reliability Database:</w:t>
       </w:r>
       <w:r>
-        <w:t> Expand the existing database schema to store the new metadata fields (</w:t>
-      </w:r>
-      <w:proofErr w:type="spellStart"/>
-      <w:r>
-        <w:t>volume_score</w:t>
-      </w:r>
-      <w:proofErr w:type="spellEnd"/>
-      <w:r>
-        <w:t xml:space="preserve">, </w:t>
-      </w:r>
-      <w:proofErr w:type="spellStart"/>
-      <w:r>
-        <w:t>confidence_score</w:t>
-      </w:r>
-      <w:proofErr w:type="spellEnd"/>
-      <w:r>
-        <w:t xml:space="preserve">, </w:t>
-      </w:r>
-      <w:proofErr w:type="spellStart"/>
-      <w:r>
-        <w:t>market_regime</w:t>
-      </w:r>
-      <w:proofErr w:type="spellEnd"/>
-      <w:r>
-        <w:t xml:space="preserve">) alongside each pattern occurrence for future </w:t>
-      </w:r>
-      <w:proofErr w:type="spellStart"/>
-      <w:r>
-        <w:t>backtesting</w:t>
-      </w:r>
-      <w:proofErr w:type="spellEnd"/>
-      <w:r>
-        <w:t xml:space="preserve"> analysis and machine learning model training.</w:t>
+        <w:t> Expand the existing database schema to store the new metadata fields (volume_score, confidence_score, market_regime) alongside each pattern occurrence for future backtesting analysis and machine learning model training.</w:t>
       </w:r>
     </w:p>
     <w:p>
@@ -855,6 +532,7 @@
           <w:b/>
           <w:bCs/>
         </w:rPr>
+        <w:lastRenderedPageBreak/>
         <w:t>Success Criteria:</w:t>
       </w:r>
       <w:r>
@@ -907,15 +585,7 @@
         <w:spacing w:line="240" w:lineRule="auto"/>
       </w:pPr>
       <w:r>
-        <w:t>The updated </w:t>
-      </w:r>
-      <w:proofErr w:type="spellStart"/>
-      <w:r>
-        <w:t>detect_all_patterns</w:t>
-      </w:r>
-      <w:proofErr w:type="spellEnd"/>
-      <w:r>
-        <w:t> function provides a unified interface for strategies to access this enhanced information.</w:t>
+        <w:t>The updated detect_all_patterns function provides a unified interface for strategies to access this enhanced information.</w:t>
       </w:r>
     </w:p>
     <w:p>
@@ -1184,21 +854,12 @@
                 <w:bCs/>
               </w:rPr>
             </w:pPr>
-            <w:proofErr w:type="spellStart"/>
-            <w:r>
-              <w:rPr>
-                <w:b/>
-                <w:bCs/>
-              </w:rPr>
-              <w:t>Backtest</w:t>
-            </w:r>
-            <w:proofErr w:type="spellEnd"/>
-            <w:r>
-              <w:rPr>
-                <w:b/>
-                <w:bCs/>
-              </w:rPr>
-              <w:t xml:space="preserve"> Insights</w:t>
+            <w:r>
+              <w:rPr>
+                <w:b/>
+                <w:bCs/>
+              </w:rPr>
+              <w:t>Backtest Insights</w:t>
             </w:r>
           </w:p>
         </w:tc>
@@ -1684,15 +1345,7 @@
               <w:spacing w:line="240" w:lineRule="auto"/>
             </w:pPr>
             <w:r>
-              <w:t xml:space="preserve">Three-candle pattern: long bearish candle, small-bodied candle (e.g., </w:t>
-            </w:r>
-            <w:proofErr w:type="spellStart"/>
-            <w:r>
-              <w:t>Doji</w:t>
-            </w:r>
-            <w:proofErr w:type="spellEnd"/>
-            <w:r>
-              <w:t>), and a long bullish candle closing above the first candle’s midpoint.</w:t>
+              <w:t>Three-candle pattern: long bearish candle, small-bodied candle (e.g., Doji), and a long bullish candle closing above the first candle’s midpoint.</w:t>
             </w:r>
           </w:p>
         </w:tc>
@@ -2120,15 +1773,7 @@
               <w:spacing w:line="240" w:lineRule="auto"/>
             </w:pPr>
             <w:r>
-              <w:t xml:space="preserve">Three-candle pattern: large bearish candle, </w:t>
-            </w:r>
-            <w:proofErr w:type="spellStart"/>
-            <w:r>
-              <w:t>Doji</w:t>
-            </w:r>
-            <w:proofErr w:type="spellEnd"/>
-            <w:r>
-              <w:t xml:space="preserve"> gapping down, and a large bullish candle gapping up.</w:t>
+              <w:t>Three-candle pattern: large bearish candle, Doji gapping down, and a large bullish candle gapping up.</w:t>
             </w:r>
           </w:p>
         </w:tc>
@@ -2166,15 +1811,7 @@
               <w:t>Stop-Loss</w:t>
             </w:r>
             <w:r>
-              <w:t xml:space="preserve">: Below the </w:t>
-            </w:r>
-            <w:proofErr w:type="spellStart"/>
-            <w:r>
-              <w:t>Doji's</w:t>
-            </w:r>
-            <w:proofErr w:type="spellEnd"/>
-            <w:r>
-              <w:t xml:space="preserve"> low.</w:t>
+              <w:t>: Below the Doji's low.</w:t>
             </w:r>
           </w:p>
         </w:tc>
@@ -2421,7 +2058,7 @@
       </w:pPr>
       <w:r>
         <w:pict w14:anchorId="7A65A0FD">
-          <v:rect id="_x0000_i1062" style="width:0;height:.75pt" o:hralign="center" o:hrstd="t" o:hrnoshade="t" o:hr="t" fillcolor="#f9fafb" stroked="f"/>
+          <v:rect id="_x0000_i1025" style="width:0;height:.75pt" o:hralign="center" o:hrstd="t" o:hrnoshade="t" o:hr="t" fillcolor="#f9fafb" stroked="f"/>
         </w:pict>
       </w:r>
     </w:p>
@@ -2593,21 +2230,12 @@
                 <w:bCs/>
               </w:rPr>
             </w:pPr>
-            <w:proofErr w:type="spellStart"/>
-            <w:r>
-              <w:rPr>
-                <w:b/>
-                <w:bCs/>
-              </w:rPr>
-              <w:t>Backtest</w:t>
-            </w:r>
-            <w:proofErr w:type="spellEnd"/>
-            <w:r>
-              <w:rPr>
-                <w:b/>
-                <w:bCs/>
-              </w:rPr>
-              <w:t xml:space="preserve"> Insights</w:t>
+            <w:r>
+              <w:rPr>
+                <w:b/>
+                <w:bCs/>
+              </w:rPr>
+              <w:t>Backtest Insights</w:t>
             </w:r>
           </w:p>
         </w:tc>
@@ -3511,15 +3139,7 @@
               <w:spacing w:line="240" w:lineRule="auto"/>
             </w:pPr>
             <w:r>
-              <w:t xml:space="preserve">Three-candle pattern: large bullish candle, </w:t>
-            </w:r>
-            <w:proofErr w:type="spellStart"/>
-            <w:r>
-              <w:t>Doji</w:t>
-            </w:r>
-            <w:proofErr w:type="spellEnd"/>
-            <w:r>
-              <w:t xml:space="preserve"> gapping up, and a large bearish candle gapping down.</w:t>
+              <w:t>Three-candle pattern: large bullish candle, Doji gapping up, and a large bearish candle gapping down.</w:t>
             </w:r>
           </w:p>
         </w:tc>
@@ -3557,15 +3177,7 @@
               <w:t>Stop-Loss</w:t>
             </w:r>
             <w:r>
-              <w:t xml:space="preserve">: Above the </w:t>
-            </w:r>
-            <w:proofErr w:type="spellStart"/>
-            <w:r>
-              <w:t>Doji's</w:t>
-            </w:r>
-            <w:proofErr w:type="spellEnd"/>
-            <w:r>
-              <w:t xml:space="preserve"> high.</w:t>
+              <w:t>: Above the Doji's high.</w:t>
             </w:r>
           </w:p>
         </w:tc>
@@ -3705,7 +3317,7 @@
       </w:pPr>
       <w:r>
         <w:pict w14:anchorId="27DDF822">
-          <v:rect id="_x0000_i1063" style="width:0;height:.75pt" o:hralign="center" o:hrstd="t" o:hrnoshade="t" o:hr="t" fillcolor="#f9fafb" stroked="f"/>
+          <v:rect id="_x0000_i1026" style="width:0;height:.75pt" o:hralign="center" o:hrstd="t" o:hrnoshade="t" o:hr="t" fillcolor="#f9fafb" stroked="f"/>
         </w:pict>
       </w:r>
     </w:p>
@@ -3877,21 +3489,12 @@
                 <w:bCs/>
               </w:rPr>
             </w:pPr>
-            <w:proofErr w:type="spellStart"/>
-            <w:r>
-              <w:rPr>
-                <w:b/>
-                <w:bCs/>
-              </w:rPr>
-              <w:t>Backtest</w:t>
-            </w:r>
-            <w:proofErr w:type="spellEnd"/>
-            <w:r>
-              <w:rPr>
-                <w:b/>
-                <w:bCs/>
-              </w:rPr>
-              <w:t xml:space="preserve"> Insights</w:t>
+            <w:r>
+              <w:rPr>
+                <w:b/>
+                <w:bCs/>
+              </w:rPr>
+              <w:t>Backtest Insights</w:t>
             </w:r>
           </w:p>
         </w:tc>
@@ -4239,23 +3842,7 @@
                 <w:b/>
                 <w:bCs/>
               </w:rPr>
-              <w:t xml:space="preserve">Upside </w:t>
-            </w:r>
-            <w:proofErr w:type="spellStart"/>
-            <w:r>
-              <w:rPr>
-                <w:b/>
-                <w:bCs/>
-              </w:rPr>
-              <w:t>Tasuki</w:t>
-            </w:r>
-            <w:proofErr w:type="spellEnd"/>
-            <w:r>
-              <w:rPr>
-                <w:b/>
-                <w:bCs/>
-              </w:rPr>
-              <w:t xml:space="preserve"> Gap</w:t>
+              <w:t>Upside Tasuki Gap</w:t>
             </w:r>
           </w:p>
         </w:tc>
@@ -4362,23 +3949,7 @@
                 <w:b/>
                 <w:bCs/>
               </w:rPr>
-              <w:t xml:space="preserve">Downside </w:t>
-            </w:r>
-            <w:proofErr w:type="spellStart"/>
-            <w:r>
-              <w:rPr>
-                <w:b/>
-                <w:bCs/>
-              </w:rPr>
-              <w:t>Tasuki</w:t>
-            </w:r>
-            <w:proofErr w:type="spellEnd"/>
-            <w:r>
-              <w:rPr>
-                <w:b/>
-                <w:bCs/>
-              </w:rPr>
-              <w:t xml:space="preserve"> Gap</w:t>
+              <w:t>Downside Tasuki Gap</w:t>
             </w:r>
           </w:p>
         </w:tc>
@@ -4791,7 +4362,7 @@
       </w:pPr>
       <w:r>
         <w:pict w14:anchorId="0984EB53">
-          <v:rect id="_x0000_i1064" style="width:0;height:.75pt" o:hralign="center" o:hrstd="t" o:hrnoshade="t" o:hr="t" fillcolor="#f9fafb" stroked="f"/>
+          <v:rect id="_x0000_i1027" style="width:0;height:.75pt" o:hralign="center" o:hrstd="t" o:hrnoshade="t" o:hr="t" fillcolor="#f9fafb" stroked="f"/>
         </w:pict>
       </w:r>
     </w:p>
@@ -4963,21 +4534,12 @@
                 <w:bCs/>
               </w:rPr>
             </w:pPr>
-            <w:proofErr w:type="spellStart"/>
-            <w:r>
-              <w:rPr>
-                <w:b/>
-                <w:bCs/>
-              </w:rPr>
-              <w:t>Backtest</w:t>
-            </w:r>
-            <w:proofErr w:type="spellEnd"/>
-            <w:r>
-              <w:rPr>
-                <w:b/>
-                <w:bCs/>
-              </w:rPr>
-              <w:t xml:space="preserve"> Insights</w:t>
+            <w:r>
+              <w:rPr>
+                <w:b/>
+                <w:bCs/>
+              </w:rPr>
+              <w:t>Backtest Insights</w:t>
             </w:r>
           </w:p>
         </w:tc>
@@ -4999,7 +4561,6 @@
             <w:pPr>
               <w:spacing w:line="240" w:lineRule="auto"/>
             </w:pPr>
-            <w:proofErr w:type="spellStart"/>
             <w:r>
               <w:rPr>
                 <w:b/>
@@ -5007,7 +4568,6 @@
               </w:rPr>
               <w:t>Doji</w:t>
             </w:r>
-            <w:proofErr w:type="spellEnd"/>
           </w:p>
         </w:tc>
         <w:tc>
@@ -5065,15 +4625,7 @@
               <w:t>Stop-Loss</w:t>
             </w:r>
             <w:r>
-              <w:t xml:space="preserve">: Above/below the </w:t>
-            </w:r>
-            <w:proofErr w:type="spellStart"/>
-            <w:r>
-              <w:t>Doji’s</w:t>
-            </w:r>
-            <w:proofErr w:type="spellEnd"/>
-            <w:r>
-              <w:t xml:space="preserve"> extremes.</w:t>
+              <w:t>: Above/below the Doji’s extremes.</w:t>
             </w:r>
           </w:p>
         </w:tc>
@@ -5249,15 +4801,7 @@
               <w:spacing w:line="240" w:lineRule="auto"/>
             </w:pPr>
             <w:r>
-              <w:t xml:space="preserve">Similar to </w:t>
-            </w:r>
-            <w:proofErr w:type="spellStart"/>
-            <w:r>
-              <w:t>Doji</w:t>
-            </w:r>
-            <w:proofErr w:type="spellEnd"/>
-            <w:r>
-              <w:t xml:space="preserve"> but with a larger body and very long wicks.</w:t>
+              <w:t>Similar to Doji but with a larger body and very long wicks.</w:t>
             </w:r>
           </w:p>
         </w:tc>
@@ -5328,24 +4872,15 @@
       </w:pPr>
       <w:r>
         <w:pict w14:anchorId="4B4480C1">
-          <v:rect id="_x0000_i1065" style="width:0;height:.75pt" o:hralign="center" o:hrstd="t" o:hrnoshade="t" o:hr="t" fillcolor="#f9fafb" stroked="f"/>
+          <v:rect id="_x0000_i1028" style="width:0;height:.75pt" o:hralign="center" o:hrstd="t" o:hrnoshade="t" o:hr="t" fillcolor="#f9fafb" stroked="f"/>
         </w:pict>
       </w:r>
-      <w:proofErr w:type="spellStart"/>
       <w:r>
         <w:rPr>
           <w:b/>
           <w:bCs/>
         </w:rPr>
-        <w:t>Backtesting</w:t>
-      </w:r>
-      <w:proofErr w:type="spellEnd"/>
-      <w:r>
-        <w:rPr>
-          <w:b/>
-          <w:bCs/>
-        </w:rPr>
-        <w:t xml:space="preserve"> Insights and Trading Tips</w:t>
+        <w:t>Backtesting Insights and Trading Tips</w:t>
       </w:r>
     </w:p>
     <w:p>
@@ -5438,15 +4973,7 @@
         <w:t>Limitations</w:t>
       </w:r>
       <w:r>
-        <w:t xml:space="preserve">: Patterns may fail in volatile markets or without context. </w:t>
-      </w:r>
-      <w:proofErr w:type="spellStart"/>
-      <w:r>
-        <w:t>Backtesting</w:t>
-      </w:r>
-      <w:proofErr w:type="spellEnd"/>
-      <w:r>
-        <w:t xml:space="preserve"> on historical data (e.g., S&amp;P 500) is recommended for strategy validation .</w:t>
+        <w:t>: Patterns may fail in volatile markets or without context. Backtesting on historical data (e.g., S&amp;P 500) is recommended for strategy validation .</w:t>
       </w:r>
     </w:p>
     <w:p>
@@ -5474,7 +5001,7 @@
       </w:pPr>
       <w:r>
         <w:pict w14:anchorId="1E0C4F65">
-          <v:rect id="_x0000_i1066" style="width:0;height:.75pt" o:hralign="center" o:hrstd="t" o:hrnoshade="t" o:hr="t" fillcolor="#f9fafb" stroked="f"/>
+          <v:rect id="_x0000_i1029" style="width:0;height:.75pt" o:hralign="center" o:hrstd="t" o:hrnoshade="t" o:hr="t" fillcolor="#f9fafb" stroked="f"/>
         </w:pict>
       </w:r>
     </w:p>
@@ -5545,25 +5072,11 @@
           <w:b/>
           <w:bCs/>
         </w:rPr>
-        <w:t xml:space="preserve">Practice and </w:t>
-      </w:r>
-      <w:proofErr w:type="spellStart"/>
-      <w:r>
-        <w:rPr>
-          <w:b/>
-          <w:bCs/>
-        </w:rPr>
-        <w:t>Backtest</w:t>
-      </w:r>
-      <w:proofErr w:type="spellEnd"/>
-      <w:r>
-        <w:t>: Use demo accounts and historical data to test strategies before live trading .</w:t>
-      </w:r>
-    </w:p>
-    <w:p>
-      <w:pPr>
-        <w:spacing w:line="240" w:lineRule="auto"/>
-      </w:pPr>
+        <w:t>Practice and Backtest</w:t>
+      </w:r>
+      <w:r>
+        <w:t>: Use demo accounts and historical data to test strategies before live trading.</w:t>
+      </w:r>
     </w:p>
     <w:sectPr>
       <w:pgSz w:w="11906" w:h="16838" w:code="9"/>
@@ -7320,6 +6833,7 @@
   <w:style w:type="character" w:default="1" w:styleId="DefaultParagraphFont">
     <w:name w:val="Default Paragraph Font"/>
     <w:uiPriority w:val="1"/>
+    <w:semiHidden/>
     <w:unhideWhenUsed/>
   </w:style>
   <w:style w:type="table" w:default="1" w:styleId="TableNormal">

</xml_diff>